<commit_message>
docs: embed architecture diagrams in PDF/DOCX deliverables
Extends generate-deliverables.js mdToHtml() with a markdown-image
regex so puppeteer-rendered PDFs resolve ![alt](path) to file:// URLs
with SVG→PNG fallback. Regenerates README/USER-MANUAL .pdf/.docx and
UNIFIED-SPEC docx with embedded diagrams.

Co-Authored-By: Claude Opus 4.7 (1M context) <noreply@anthropic.com>
</commit_message>
<xml_diff>
--- a/USER-MANUAL.docx
+++ b/USER-MANUAL.docx
@@ -6786,7 +6786,44 @@
     </w:p>
     <w:p>
       <w:r>
-        <w:t xml:space="preserve">!Deployment stack — entire system runs inside Docker Compose on the city's network. No cloud, no outbound by default.</w:t>
+        <w:drawing>
+          <wp:inline distT="0" distB="0" distL="0" distR="0">
+            <wp:extent cx="5715000" cy="3810000"/>
+            <wp:effectExtent t="0" r="0" b="0" l="0"/>
+            <wp:docPr id="1" name="" descr="" title=""/>
+            <wp:cNvGraphicFramePr>
+              <a:graphicFrameLocks xmlns:a="http://schemas.openxmlformats.org/drawingml/2006/main" noChangeAspect="1"/>
+            </wp:cNvGraphicFramePr>
+            <a:graphic xmlns:a="http://schemas.openxmlformats.org/drawingml/2006/main">
+              <a:graphicData uri="http://schemas.openxmlformats.org/drawingml/2006/picture">
+                <pic:pic xmlns:pic="http://schemas.openxmlformats.org/drawingml/2006/picture">
+                  <pic:nvPicPr>
+                    <pic:cNvPr id="0" name="" descr=""/>
+                    <pic:cNvPicPr>
+                      <a:picLocks noChangeAspect="1" noChangeArrowheads="1"/>
+                    </pic:cNvPicPr>
+                  </pic:nvPicPr>
+                  <pic:blipFill>
+                    <a:blip r:embed="rId7" cstate="none"/>
+                    <a:srcRect/>
+                    <a:stretch>
+                      <a:fillRect/>
+                    </a:stretch>
+                  </pic:blipFill>
+                  <pic:spPr bwMode="auto">
+                    <a:xfrm>
+                      <a:off x="0" y="0"/>
+                      <a:ext cx="5715000" cy="3810000"/>
+                    </a:xfrm>
+                    <a:prstGeom prst="rect">
+                      <a:avLst/>
+                    </a:prstGeom>
+                  </pic:spPr>
+                </pic:pic>
+              </a:graphicData>
+            </a:graphic>
+          </wp:inline>
+        </w:drawing>
       </w:r>
     </w:p>
     <w:p>
@@ -7020,7 +7057,44 @@
     </w:p>
     <w:p>
       <w:r>
-        <w:t xml:space="preserve">!LLM call flow — records-ai application code routes through civiccore.llm (context assembly, template resolution, model registry, provider factory) to a local Ollama provider, with optional cloud providers behind opt-in extras.</w:t>
+        <w:drawing>
+          <wp:inline distT="0" distB="0" distL="0" distR="0">
+            <wp:extent cx="5715000" cy="3810000"/>
+            <wp:effectExtent t="0" r="0" b="0" l="0"/>
+            <wp:docPr id="1" name="" descr="" title=""/>
+            <wp:cNvGraphicFramePr>
+              <a:graphicFrameLocks xmlns:a="http://schemas.openxmlformats.org/drawingml/2006/main" noChangeAspect="1"/>
+            </wp:cNvGraphicFramePr>
+            <a:graphic xmlns:a="http://schemas.openxmlformats.org/drawingml/2006/main">
+              <a:graphicData uri="http://schemas.openxmlformats.org/drawingml/2006/picture">
+                <pic:pic xmlns:pic="http://schemas.openxmlformats.org/drawingml/2006/picture">
+                  <pic:nvPicPr>
+                    <pic:cNvPr id="0" name="" descr=""/>
+                    <pic:cNvPicPr>
+                      <a:picLocks noChangeAspect="1" noChangeArrowheads="1"/>
+                    </pic:cNvPicPr>
+                  </pic:nvPicPr>
+                  <pic:blipFill>
+                    <a:blip r:embed="rId8" cstate="none"/>
+                    <a:srcRect/>
+                    <a:stretch>
+                      <a:fillRect/>
+                    </a:stretch>
+                  </pic:blipFill>
+                  <pic:spPr bwMode="auto">
+                    <a:xfrm>
+                      <a:off x="0" y="0"/>
+                      <a:ext cx="5715000" cy="3810000"/>
+                    </a:xfrm>
+                    <a:prstGeom prst="rect">
+                      <a:avLst/>
+                    </a:prstGeom>
+                  </pic:spPr>
+                </pic:pic>
+              </a:graphicData>
+            </a:graphic>
+          </wp:inline>
+        </w:drawing>
       </w:r>
     </w:p>
     <w:p>
@@ -7214,7 +7288,44 @@
     </w:p>
     <w:p>
       <w:r>
-        <w:t xml:space="preserve">!Sovereignty boundary — all runtime components (FastAPI, Celery, Postgres+pgvector, Ollama, local volumes) live inside the city's on-prem network. No outbound by default; cloud is opt-in only. Connector credentials are encrypted at rest with Fernet.</w:t>
+        <w:drawing>
+          <wp:inline distT="0" distB="0" distL="0" distR="0">
+            <wp:extent cx="5715000" cy="3810000"/>
+            <wp:effectExtent t="0" r="0" b="0" l="0"/>
+            <wp:docPr id="1" name="" descr="" title=""/>
+            <wp:cNvGraphicFramePr>
+              <a:graphicFrameLocks xmlns:a="http://schemas.openxmlformats.org/drawingml/2006/main" noChangeAspect="1"/>
+            </wp:cNvGraphicFramePr>
+            <a:graphic xmlns:a="http://schemas.openxmlformats.org/drawingml/2006/main">
+              <a:graphicData uri="http://schemas.openxmlformats.org/drawingml/2006/picture">
+                <pic:pic xmlns:pic="http://schemas.openxmlformats.org/drawingml/2006/picture">
+                  <pic:nvPicPr>
+                    <pic:cNvPr id="0" name="" descr=""/>
+                    <pic:cNvPicPr>
+                      <a:picLocks noChangeAspect="1" noChangeArrowheads="1"/>
+                    </pic:cNvPicPr>
+                  </pic:nvPicPr>
+                  <pic:blipFill>
+                    <a:blip r:embed="rId9" cstate="none"/>
+                    <a:srcRect/>
+                    <a:stretch>
+                      <a:fillRect/>
+                    </a:stretch>
+                  </pic:blipFill>
+                  <pic:spPr bwMode="auto">
+                    <a:xfrm>
+                      <a:off x="0" y="0"/>
+                      <a:ext cx="5715000" cy="3810000"/>
+                    </a:xfrm>
+                    <a:prstGeom prst="rect">
+                      <a:avLst/>
+                    </a:prstGeom>
+                  </pic:spPr>
+                </pic:pic>
+              </a:graphicData>
+            </a:graphic>
+          </wp:inline>
+        </w:drawing>
       </w:r>
     </w:p>
     <w:p>

</xml_diff>